<commit_message>
Add supporting data bullets to board decision asks
https://claude.ai/code/session_01D964obrM7r6TuydQryZouf
</commit_message>
<xml_diff>
--- a/meridian/board_opening_remarks.docx
+++ b/meridian/board_opening_remarks.docx
@@ -718,7 +718,7 @@
           </w:p>
           <w:p>
             <w:pPr>
-              <w:spacing w:before="60" w:after="100"/>
+              <w:spacing w:before="120" w:after="40"/>
               <w:ind w:left="288"/>
             </w:pPr>
             <w:r>
@@ -744,7 +744,76 @@
           </w:p>
           <w:p>
             <w:pPr>
-              <w:spacing w:before="60" w:after="100"/>
+              <w:spacing w:before="20" w:after="20"/>
+              <w:ind w:left="648"/>
+            </w:pPr>
+            <w:r>
+              <w:rPr>
+                <w:rFonts w:ascii="Calibri" w:hAnsi="Calibri"/>
+                <w:b w:val="0"/>
+                <w:i w:val="0"/>
+                <w:color w:val="CCDDEE"/>
+                <w:sz w:val="17"/>
+              </w:rPr>
+              <w:t>▸  28% of sales reps cannot articulate Meridian's AI differentiation vs. Asana — cited in 28% of sales open-ends (Employee Survey, Oct 2025)</w:t>
+            </w:r>
+          </w:p>
+          <w:p>
+            <w:pPr>
+              <w:spacing w:before="20" w:after="20"/>
+              <w:ind w:left="648"/>
+            </w:pPr>
+            <w:r>
+              <w:rPr>
+                <w:rFonts w:ascii="Calibri" w:hAnsi="Calibri"/>
+                <w:b w:val="0"/>
+                <w:i w:val="0"/>
+                <w:color w:val="CCDDEE"/>
+                <w:sz w:val="17"/>
+              </w:rPr>
+              <w:t>▸  Copilot 44% attach rate on enterprise Q4 renewals shows AI is already a buying criterion, not a nice-to-have</w:t>
+            </w:r>
+          </w:p>
+          <w:p>
+            <w:pPr>
+              <w:spacing w:before="20" w:after="20"/>
+              <w:ind w:left="648"/>
+            </w:pPr>
+            <w:r>
+              <w:rPr>
+                <w:rFonts w:ascii="Calibri" w:hAnsi="Calibri"/>
+                <w:b w:val="0"/>
+                <w:i w:val="0"/>
+                <w:color w:val="CCDDEE"/>
+                <w:sz w:val="17"/>
+              </w:rPr>
+              <w:t>▸  R&amp;D at 25.4% of revenue (2025) — highest since IPO — without a declared platform identity, spend is unfocused</w:t>
+            </w:r>
+          </w:p>
+          <w:p>
+            <w:pPr>
+              <w:spacing w:before="20" w:after="20"/>
+              <w:ind w:left="648"/>
+            </w:pPr>
+            <w:r>
+              <w:rPr>
+                <w:rFonts w:ascii="Calibri" w:hAnsi="Calibri"/>
+                <w:b w:val="0"/>
+                <w:i w:val="0"/>
+                <w:color w:val="CCDDEE"/>
+                <w:sz w:val="17"/>
+              </w:rPr>
+              <w:t>▸  Investor Day is March 11: public positioning must match internal conviction or we create a credibility gap</w:t>
+            </w:r>
+          </w:p>
+          <w:p>
+            <w:pPr>
+              <w:spacing w:before="40" w:after="40"/>
+            </w:pPr>
+          </w:p>
+          <w:p>
+            <w:pPr>
+              <w:spacing w:before="120" w:after="40"/>
               <w:ind w:left="288"/>
             </w:pPr>
             <w:r>
@@ -770,7 +839,76 @@
           </w:p>
           <w:p>
             <w:pPr>
-              <w:spacing w:before="60" w:after="100"/>
+              <w:spacing w:before="20" w:after="20"/>
+              <w:ind w:left="648"/>
+            </w:pPr>
+            <w:r>
+              <w:rPr>
+                <w:rFonts w:ascii="Calibri" w:hAnsi="Calibri"/>
+                <w:b w:val="0"/>
+                <w:i w:val="0"/>
+                <w:color w:val="CCDDEE"/>
+                <w:sz w:val="17"/>
+              </w:rPr>
+              <w:t>▸  Current Copilot price: $40/seat/month add-on — at 710 seats this yields ~$340K ARR run-rate; consumption model would tie revenue to actual agent usage and scale faster with enterprise adoption</w:t>
+            </w:r>
+          </w:p>
+          <w:p>
+            <w:pPr>
+              <w:spacing w:before="20" w:after="20"/>
+              <w:ind w:left="648"/>
+            </w:pPr>
+            <w:r>
+              <w:rPr>
+                <w:rFonts w:ascii="Calibri" w:hAnsi="Calibri"/>
+                <w:b w:val="0"/>
+                <w:i w:val="0"/>
+                <w:color w:val="CCDDEE"/>
+                <w:sz w:val="17"/>
+              </w:rPr>
+              <w:t>▸  Mid-market renewals already demanding Copilot bundled at no cost (Q3 2025 earnings); without a clear model we are giving it away or losing deals</w:t>
+            </w:r>
+          </w:p>
+          <w:p>
+            <w:pPr>
+              <w:spacing w:before="20" w:after="20"/>
+              <w:ind w:left="648"/>
+            </w:pPr>
+            <w:r>
+              <w:rPr>
+                <w:rFonts w:ascii="Calibri" w:hAnsi="Calibri"/>
+                <w:b w:val="0"/>
+                <w:i w:val="0"/>
+                <w:color w:val="CCDDEE"/>
+                <w:sz w:val="17"/>
+              </w:rPr>
+              <w:t>▸  CPO memo explicitly states: 'The Copilot pricing model is a strategic decision, not a product decision — CPO recommends CFO and CRO jointly own this'</w:t>
+            </w:r>
+          </w:p>
+          <w:p>
+            <w:pPr>
+              <w:spacing w:before="20" w:after="20"/>
+              <w:ind w:left="648"/>
+            </w:pPr>
+            <w:r>
+              <w:rPr>
+                <w:rFonts w:ascii="Calibri" w:hAnsi="Calibri"/>
+                <w:b w:val="0"/>
+                <w:i w:val="0"/>
+                <w:color w:val="CCDDEE"/>
+                <w:sz w:val="17"/>
+              </w:rPr>
+              <w:t>▸  Consumption revenue requires different forecasting discipline and sales compensation design — the longer we wait, the more 2026 quota plans are built on the wrong model</w:t>
+            </w:r>
+          </w:p>
+          <w:p>
+            <w:pPr>
+              <w:spacing w:before="40" w:after="40"/>
+            </w:pPr>
+          </w:p>
+          <w:p>
+            <w:pPr>
+              <w:spacing w:before="120" w:after="40"/>
               <w:ind w:left="288"/>
             </w:pPr>
             <w:r>
@@ -793,6 +931,75 @@
               </w:rPr>
               <w:t>The 2026 AI roadmap has six major commitments. Engineering can execute three well or six poorly. I will present my recommended three. I need the board to hold the line with me when stakeholders push for the other three.</w:t>
             </w:r>
+          </w:p>
+          <w:p>
+            <w:pPr>
+              <w:spacing w:before="20" w:after="20"/>
+              <w:ind w:left="648"/>
+            </w:pPr>
+            <w:r>
+              <w:rPr>
+                <w:rFonts w:ascii="Calibri" w:hAnsi="Calibri"/>
+                <w:b w:val="0"/>
+                <w:i w:val="0"/>
+                <w:color w:val="CCDDEE"/>
+                <w:sz w:val="17"/>
+              </w:rPr>
+              <w:t>▸  2025 delivery record: 6 of 12 commitments slipped ≥1 quarter; 2 deferred outright — on a plan with fewer competing priorities than 2026</w:t>
+            </w:r>
+          </w:p>
+          <w:p>
+            <w:pPr>
+              <w:spacing w:before="20" w:after="20"/>
+              <w:ind w:left="648"/>
+            </w:pPr>
+            <w:r>
+              <w:rPr>
+                <w:rFonts w:ascii="Calibri" w:hAnsi="Calibri"/>
+                <w:b w:val="0"/>
+                <w:i w:val="0"/>
+                <w:color w:val="CCDDEE"/>
+                <w:sz w:val="17"/>
+              </w:rPr>
+              <w:t>▸  Engineering net adds in 2026: ~25 actual vs. 80 assumed in the plan (15% annual attrition on 750-person org)</w:t>
+            </w:r>
+          </w:p>
+          <w:p>
+            <w:pPr>
+              <w:spacing w:before="20" w:after="20"/>
+              <w:ind w:left="648"/>
+            </w:pPr>
+            <w:r>
+              <w:rPr>
+                <w:rFonts w:ascii="Calibri" w:hAnsi="Calibri"/>
+                <w:b w:val="0"/>
+                <w:i w:val="0"/>
+                <w:color w:val="CCDDEE"/>
+                <w:sz w:val="17"/>
+              </w:rPr>
+              <w:t>▸  The six 2026 commitments span: Copilot governance suite (Q1), agent builder (Q2), resource mgmt module (Q2), workflow marketplace (Q3), pricing model refresh (Q3), GxP environment (Q4) — each is a multi-quarter engineering effort</w:t>
+            </w:r>
+          </w:p>
+          <w:p>
+            <w:pPr>
+              <w:spacing w:before="20" w:after="20"/>
+              <w:ind w:left="648"/>
+            </w:pPr>
+            <w:r>
+              <w:rPr>
+                <w:rFonts w:ascii="Calibri" w:hAnsi="Calibri"/>
+                <w:b w:val="0"/>
+                <w:i w:val="0"/>
+                <w:color w:val="CCDDEE"/>
+                <w:sz w:val="17"/>
+              </w:rPr>
+              <w:t>▸  Helio retention cliff in 2026: the agent-builder depends on 28 Helio engineers whose cash compensation cliff arrives this year; if they leave, the Q2 commitment is at risk</w:t>
+            </w:r>
+          </w:p>
+          <w:p>
+            <w:pPr>
+              <w:spacing w:before="40" w:after="40"/>
+            </w:pPr>
           </w:p>
         </w:tc>
       </w:tr>

</xml_diff>